<commit_message>
Ajustei o local do nome de Talysson
</commit_message>
<xml_diff>
--- a/Gerenciamento/Documento_de_Visao_RestauranteAki_.docx
+++ b/Gerenciamento/Documento_de_Visao_RestauranteAki_.docx
@@ -348,6 +348,63 @@
     </w:p>
     <w:p>
       <w:pPr>
+        <w:spacing w:before="76"/>
+        <w:ind w:left="2488" w:right="2549"/>
+        <w:jc w:val="center"/>
+        <w:rPr>
+          <w:b/>
+          <w:sz w:val="24"/>
+          <w:szCs w:val="24"/>
+        </w:rPr>
+      </w:pPr>
+      <w:r>
+        <w:rPr>
+          <w:b/>
+          <w:color w:val="000000"/>
+          <w:sz w:val="35"/>
+          <w:szCs w:val="35"/>
+        </w:rPr>
+        <w:tab/>
+      </w:r>
+      <w:r>
+        <w:rPr>
+          <w:b/>
+          <w:color w:val="000000"/>
+          <w:sz w:val="35"/>
+          <w:szCs w:val="35"/>
+        </w:rPr>
+        <w:tab/>
+      </w:r>
+      <w:r>
+        <w:rPr>
+          <w:b/>
+          <w:color w:val="000000"/>
+          <w:sz w:val="35"/>
+          <w:szCs w:val="35"/>
+        </w:rPr>
+        <w:tab/>
+      </w:r>
+      <w:r>
+        <w:rPr>
+          <w:b/>
+          <w:color w:val="000000"/>
+          <w:sz w:val="35"/>
+          <w:szCs w:val="35"/>
+        </w:rPr>
+        <w:tab/>
+      </w:r>
+      <w:r>
+        <w:rPr>
+          <w:b/>
+          <w:color w:val="000000"/>
+          <w:sz w:val="35"/>
+          <w:szCs w:val="35"/>
+        </w:rPr>
+        <w:tab/>
+      </w:r>
+    </w:p>
+    <w:p>
+      <w:pPr>
         <w:pBdr>
           <w:top w:val="nil"/>
           <w:left w:val="nil"/>
@@ -370,16 +427,58 @@
         <w:ind w:left="1416" w:firstLine="707"/>
         <w:jc w:val="center"/>
         <w:rPr>
-          <w:sz w:val="24"/>
-          <w:szCs w:val="24"/>
-        </w:rPr>
-      </w:pPr>
-      <w:r>
-        <w:rPr>
           <w:rFonts w:ascii="Calibri" w:hAnsi="Calibri"/>
           <w:sz w:val="24"/>
         </w:rPr>
+      </w:pPr>
+      <w:r>
+        <w:rPr>
+          <w:rFonts w:ascii="Calibri" w:hAnsi="Calibri"/>
+          <w:sz w:val="24"/>
+        </w:rPr>
         <w:t>JOÃO VICTOR SILVA DE HUNGRIA</w:t>
+      </w:r>
+    </w:p>
+    <w:p>
+      <w:pPr>
+        <w:spacing w:line="360" w:lineRule="auto"/>
+        <w:ind w:left="1416" w:firstLine="707"/>
+        <w:rPr>
+          <w:rFonts w:asciiTheme="majorHAnsi" w:hAnsiTheme="majorHAnsi" w:cstheme="majorHAnsi"/>
+          <w:sz w:val="24"/>
+          <w:szCs w:val="24"/>
+        </w:rPr>
+      </w:pPr>
+      <w:r>
+        <w:rPr>
+          <w:rFonts w:ascii="Calibri" w:hAnsi="Calibri"/>
+          <w:sz w:val="24"/>
+        </w:rPr>
+        <w:t xml:space="preserve">                               </w:t>
+      </w:r>
+      <w:r>
+        <w:rPr>
+          <w:rFonts w:asciiTheme="majorHAnsi" w:hAnsiTheme="majorHAnsi" w:cstheme="majorHAnsi"/>
+          <w:sz w:val="24"/>
+          <w:szCs w:val="24"/>
+        </w:rPr>
+        <w:t>TALYSSON</w:t>
+      </w:r>
+      <w:r>
+        <w:rPr>
+          <w:rFonts w:asciiTheme="majorHAnsi" w:hAnsiTheme="majorHAnsi" w:cstheme="majorHAnsi"/>
+          <w:sz w:val="24"/>
+          <w:szCs w:val="24"/>
+        </w:rPr>
+        <w:t xml:space="preserve"> </w:t>
+      </w:r>
+      <w:r>
+        <w:rPr>
+          <w:rFonts w:asciiTheme="majorHAnsi" w:hAnsiTheme="majorHAnsi" w:cstheme="majorHAnsi"/>
+          <w:sz w:val="24"/>
+          <w:szCs w:val="24"/>
+        </w:rPr>
+        <w:t>FELIPE VASCONCELOS SANTOS</w:t>
       </w:r>
     </w:p>
     <w:p>
@@ -432,14 +531,7 @@
           <w:rFonts w:ascii="Calibri" w:hAnsi="Calibri"/>
           <w:sz w:val="24"/>
         </w:rPr>
-        <w:t xml:space="preserve">    </w:t>
-      </w:r>
-      <w:r>
-        <w:rPr>
-          <w:rFonts w:ascii="Calibri" w:hAnsi="Calibri"/>
-          <w:sz w:val="24"/>
-        </w:rPr>
-        <w:t>PEDRO HENRIQUE OLIVEIRA DANTAS</w:t>
+        <w:t xml:space="preserve">    PEDRO HENRIQUE OLIVEIRA DANTAS</w:t>
       </w:r>
     </w:p>
     <w:p>
@@ -448,8 +540,8 @@
         <w:ind w:left="708"/>
         <w:jc w:val="center"/>
         <w:rPr>
-          <w:sz w:val="24"/>
-          <w:szCs w:val="24"/>
+          <w:rFonts w:ascii="Calibri" w:hAnsi="Calibri"/>
+          <w:sz w:val="24"/>
         </w:rPr>
         <w:sectPr>
           <w:footerReference w:type="default" r:id="rId8"/>
@@ -464,34 +556,7 @@
           <w:rFonts w:ascii="Calibri" w:hAnsi="Calibri"/>
           <w:sz w:val="24"/>
         </w:rPr>
-        <w:t xml:space="preserve">            </w:t>
-      </w:r>
-      <w:r>
-        <w:rPr>
-          <w:rFonts w:ascii="Calibri" w:hAnsi="Calibri"/>
-          <w:sz w:val="24"/>
-        </w:rPr>
-        <w:t>RENNE BISPO DOS SANTOS</w:t>
-      </w:r>
-    </w:p>
-    <w:p>
-      <w:pPr>
-        <w:spacing w:before="76"/>
-        <w:ind w:left="2488" w:right="2549"/>
-        <w:jc w:val="center"/>
-        <w:rPr>
-          <w:b/>
-          <w:sz w:val="24"/>
-          <w:szCs w:val="24"/>
-        </w:rPr>
-      </w:pPr>
-      <w:r>
-        <w:rPr>
-          <w:rFonts w:ascii="Calibri" w:hAnsi="Calibri"/>
-          <w:sz w:val="24"/>
-        </w:rPr>
-        <w:lastRenderedPageBreak/>
-        <w:t>TALYSSON FELIPE VASCONCELOS SANTOS</w:t>
+        <w:t xml:space="preserve">            RENNE BISPO DOS SANTOS</w:t>
       </w:r>
     </w:p>
     <w:p>
@@ -1532,15 +1597,7 @@
           <w:sz w:val="24"/>
           <w:szCs w:val="24"/>
         </w:rPr>
-        <w:t xml:space="preserve">Alternativas e </w:t>
-      </w:r>
-      <w:r>
-        <w:rPr>
-          <w:color w:val="000000"/>
-          <w:sz w:val="24"/>
-          <w:szCs w:val="24"/>
-        </w:rPr>
-        <w:t>concorrências</w:t>
+        <w:t>Alternativas e concorrências</w:t>
       </w:r>
     </w:p>
     <w:p>
@@ -1685,15 +1742,7 @@
           <w:sz w:val="24"/>
           <w:szCs w:val="24"/>
         </w:rPr>
-        <w:t xml:space="preserve">pagamento personalizado através de consumo em </w:t>
-      </w:r>
-      <w:r>
-        <w:rPr>
-          <w:color w:val="000000"/>
-          <w:sz w:val="24"/>
-          <w:szCs w:val="24"/>
-        </w:rPr>
-        <w:t>restaurantes. Serão apresentados os problemas que acarretam nesse projeto, e como tais problemas podem ser solucionados.</w:t>
+        <w:t>pagamento personalizado através de consumo em restaurantes. Serão apresentados os problemas que acarretam nesse projeto, e como tais problemas podem ser solucionados.</w:t>
       </w:r>
     </w:p>
     <w:p>
@@ -1973,15 +2022,7 @@
                 <w:sz w:val="24"/>
                 <w:szCs w:val="24"/>
               </w:rPr>
-              <w:t xml:space="preserve">Os </w:t>
-            </w:r>
-            <w:r>
-              <w:rPr>
-                <w:color w:val="000000"/>
-                <w:sz w:val="24"/>
-                <w:szCs w:val="24"/>
-              </w:rPr>
-              <w:t>indivíduos que desejam realizar uma experiência singular ao ir para uma reunião com amigos.</w:t>
+              <w:t>Os indivíduos que desejam realizar uma experiência singular ao ir para uma reunião com amigos.</w:t>
             </w:r>
           </w:p>
         </w:tc>
@@ -3454,15 +3495,7 @@
                 <w:sz w:val="24"/>
                 <w:szCs w:val="24"/>
               </w:rPr>
-              <w:t xml:space="preserve">Garantir o processo de compra e finalização de um </w:t>
-            </w:r>
-            <w:r>
-              <w:rPr>
-                <w:color w:val="000000"/>
-                <w:sz w:val="24"/>
-                <w:szCs w:val="24"/>
-              </w:rPr>
-              <w:t>pedido.</w:t>
+              <w:t>Garantir o processo de compra e finalização de um pedido.</w:t>
             </w:r>
           </w:p>
         </w:tc>
@@ -4253,10 +4286,7 @@
         </w:rPr>
       </w:pPr>
       <w:r>
-        <w:t xml:space="preserve">Atualmente os usuários (pessoas) que querem ter uma experiência </w:t>
-      </w:r>
-      <w:r>
-        <w:t>personalizada no método de pagamento de consumo individual.</w:t>
+        <w:t>Atualmente os usuários (pessoas) que querem ter uma experiência personalizada no método de pagamento de consumo individual.</w:t>
       </w:r>
     </w:p>
     <w:p>
@@ -4317,16 +4347,7 @@
           <w:sz w:val="24"/>
           <w:szCs w:val="24"/>
         </w:rPr>
-        <w:lastRenderedPageBreak/>
-        <w:t>Toda a comunidade, envolve desde pessoas (usuários), a proprietários(donos de restaurantes), que necessitam fornecer a melhor experiência no seu estabele</w:t>
-      </w:r>
-      <w:r>
-        <w:rPr>
-          <w:color w:val="000000"/>
-          <w:sz w:val="24"/>
-          <w:szCs w:val="24"/>
-        </w:rPr>
-        <w:t>cimento ou na sua visita que logo é suma importância uma otima primeira impressão.</w:t>
+        <w:t>Toda a comunidade, envolve desde pessoas (usuários), a proprietários(donos de restaurantes), que necessitam fornecer a melhor experiência no seu estabelecimento ou na sua visita que logo é suma importância uma otima primeira impressão.</w:t>
       </w:r>
     </w:p>
     <w:p>
@@ -4344,6 +4365,7 @@
         <w:jc w:val="both"/>
       </w:pPr>
       <w:r>
+        <w:lastRenderedPageBreak/>
         <w:t>Alternativas e concorrência</w:t>
       </w:r>
     </w:p>
@@ -4905,15 +4927,7 @@
                 <w:sz w:val="24"/>
                 <w:szCs w:val="24"/>
               </w:rPr>
-              <w:t xml:space="preserve">Pagamento </w:t>
-            </w:r>
-            <w:r>
-              <w:rPr>
-                <w:color w:val="000000"/>
-                <w:sz w:val="24"/>
-                <w:szCs w:val="24"/>
-              </w:rPr>
-              <w:t>simplificado</w:t>
+              <w:t>Pagamento simplificado</w:t>
             </w:r>
           </w:p>
         </w:tc>
@@ -5597,7 +5611,6 @@
           <w:sz w:val="24"/>
           <w:szCs w:val="24"/>
         </w:rPr>
-        <w:lastRenderedPageBreak/>
         <w:t>R07.</w:t>
       </w:r>
       <w:r>
@@ -5798,6 +5811,7 @@
           <w:sz w:val="24"/>
           <w:szCs w:val="24"/>
         </w:rPr>
+        <w:lastRenderedPageBreak/>
         <w:t>R15.</w:t>
       </w:r>
       <w:r>
@@ -6126,7 +6140,6 @@
           <w:sz w:val="24"/>
           <w:szCs w:val="24"/>
         </w:rPr>
-        <w:lastRenderedPageBreak/>
         <w:t>R02.</w:t>
       </w:r>
       <w:r>
@@ -6515,6 +6528,7 @@
           <w:szCs w:val="24"/>
           <w:lang w:val="pt-BR"/>
         </w:rPr>
+        <w:lastRenderedPageBreak/>
         <w:t>GrandChef - Sistema para Restaurantes</w:t>
       </w:r>
       <w:r>

</xml_diff>